<commit_message>
Agrega seccion de buzon fisico y costo pendiente a propuesta Mi Gran Idea
</commit_message>
<xml_diff>
--- a/_content/Propuesta_Mi_Gran_Idea_SUPRICOM.docx
+++ b/_content/Propuesta_Mi_Gran_Idea_SUPRICOM.docx
@@ -151,7 +151,7 @@
         <w:rPr>
           <w:sz w:val="22"/>
         </w:rPr>
-        <w:t>4. Integración con el Panel SUPRICOM</w:t>
+        <w:t>4. Buzón Físico para Personal sin Acceso al Panel</w:t>
       </w:r>
     </w:p>
     <w:p>
@@ -162,7 +162,7 @@
         <w:rPr>
           <w:sz w:val="22"/>
         </w:rPr>
-        <w:t>5. Funcionalidades del Módulo</w:t>
+        <w:t>5. Integración con el Panel SUPRICOM</w:t>
       </w:r>
     </w:p>
     <w:p>
@@ -173,7 +173,7 @@
         <w:rPr>
           <w:sz w:val="22"/>
         </w:rPr>
-        <w:t>6. Flujo del Proceso (Paso a Paso)</w:t>
+        <w:t>6. Funcionalidades del Módulo</w:t>
       </w:r>
     </w:p>
     <w:p>
@@ -184,7 +184,7 @@
         <w:rPr>
           <w:sz w:val="22"/>
         </w:rPr>
-        <w:t>7. Categorías de Ideas</w:t>
+        <w:t>7. Flujo del Proceso (Paso a Paso)</w:t>
       </w:r>
     </w:p>
     <w:p>
@@ -195,7 +195,7 @@
         <w:rPr>
           <w:sz w:val="22"/>
         </w:rPr>
-        <w:t>8. Sistema de Evaluación y Puntaje</w:t>
+        <w:t>8. Categorías de Ideas</w:t>
       </w:r>
     </w:p>
     <w:p>
@@ -206,7 +206,7 @@
         <w:rPr>
           <w:sz w:val="22"/>
         </w:rPr>
-        <w:t>9. Sistema de Reconocimiento</w:t>
+        <w:t>9. Sistema de Evaluación y Puntaje</w:t>
       </w:r>
     </w:p>
     <w:p>
@@ -214,7 +214,7 @@
         <w:rPr>
           <w:sz w:val="22"/>
         </w:rPr>
-        <w:t>10. Roles y Responsabilidades</w:t>
+        <w:t>10. Sistema de Reconocimiento</w:t>
       </w:r>
     </w:p>
     <w:p>
@@ -222,7 +222,7 @@
         <w:rPr>
           <w:sz w:val="22"/>
         </w:rPr>
-        <w:t>11. KPIs del Programa</w:t>
+        <w:t>11. Roles y Responsabilidades</w:t>
       </w:r>
     </w:p>
     <w:p>
@@ -230,7 +230,7 @@
         <w:rPr>
           <w:sz w:val="22"/>
         </w:rPr>
-        <w:t>12. Plan de Implementación</w:t>
+        <w:t>12. KPIs del Programa</w:t>
       </w:r>
     </w:p>
     <w:p>
@@ -238,7 +238,15 @@
         <w:rPr>
           <w:sz w:val="22"/>
         </w:rPr>
-        <w:t>13. Anexos</w:t>
+        <w:t>13. Plan de Implementación</w:t>
+      </w:r>
+    </w:p>
+    <w:p>
+      <w:r>
+        <w:rPr>
+          <w:sz w:val="22"/>
+        </w:rPr>
+        <w:t>14. Anexos</w:t>
       </w:r>
     </w:p>
     <w:p>
@@ -885,7 +893,306 @@
         <w:rPr>
           <w:color w:val="1A1A2E"/>
         </w:rPr>
-        <w:t>4. Integración con el Panel SUPRICOM</w:t>
+        <w:t>4. Buzón Físico para Personal sin Acceso al Panel</w:t>
+      </w:r>
+    </w:p>
+    <w:p>
+      <w:r>
+        <w:t>Parte del personal de SUPRICOM (almacén, limpieza, entre otros) no dispone de acceso al Panel digital. Para garantizar que nadie quede excluido del programa, se implementa un buzón físico complementario en la entrada del almacén.</w:t>
+      </w:r>
+    </w:p>
+    <w:p>
+      <w:pPr>
+        <w:pStyle w:val="Heading2"/>
+      </w:pPr>
+      <w:r>
+        <w:rPr>
+          <w:color w:val="1A1A2E"/>
+        </w:rPr>
+        <w:t>4.1 Ubicación</w:t>
+      </w:r>
+    </w:p>
+    <w:p>
+      <w:r>
+        <w:t>Único buzón físico: fijo en la pared de la entrada del almacén, con ranura para papel doblado en tres, cerradura de seguridad y un letrero visible que diga "MI GRAN IDEA — Depósito tus ideas aquí".</w:t>
+      </w:r>
+    </w:p>
+    <w:p>
+      <w:pPr>
+        <w:pStyle w:val="Heading2"/>
+      </w:pPr>
+      <w:r>
+        <w:rPr>
+          <w:color w:val="1A1A2E"/>
+        </w:rPr>
+        <w:t>4.2 Formato del papelito</w:t>
+      </w:r>
+    </w:p>
+    <w:p>
+      <w:r>
+        <w:t>Se imprime en hojas de color azul claro (para que destaquen) en tamaño media carta (A5). El formato predefinido evita papeles rotos, garabatos ilegibles o ideas incompletas:</w:t>
+      </w:r>
+    </w:p>
+    <w:p>
+      <w:r>
+        <w:rPr>
+          <w:b/>
+        </w:rPr>
+        <w:t>Diseño del papelito:</w:t>
+      </w:r>
+    </w:p>
+    <w:p>
+      <w:pPr>
+        <w:pStyle w:val="ListBullet"/>
+      </w:pPr>
+      <w:r>
+        <w:t xml:space="preserve"> Cabecera: "TU GRAN IDEA PARA SUPRICOM" en negrita.</w:t>
+      </w:r>
+    </w:p>
+    <w:p>
+      <w:pPr>
+        <w:pStyle w:val="ListBullet"/>
+      </w:pPr>
+      <w:r>
+        <w:t xml:space="preserve"> Línea: "¿Qué mejorarías?" seguida de 3 líneas punteadas para escribir.</w:t>
+      </w:r>
+    </w:p>
+    <w:p>
+      <w:pPr>
+        <w:pStyle w:val="ListBullet"/>
+      </w:pPr>
+      <w:r>
+        <w:t xml:space="preserve"> Línea: "Tu nombre (opcional): ______"</w:t>
+      </w:r>
+    </w:p>
+    <w:p>
+      <w:pPr>
+        <w:pStyle w:val="ListBullet"/>
+      </w:pPr>
+      <w:r>
+        <w:t xml:space="preserve"> Categoría: 4 casillas de verificación — Proceso | Cliente | Producto | Otro.</w:t>
+      </w:r>
+    </w:p>
+    <w:p>
+      <w:pPr>
+        <w:pStyle w:val="ListBullet"/>
+      </w:pPr>
+      <w:r>
+        <w:t xml:space="preserve"> Reverse: instrucciones breves + explicación del programa.</w:t>
+      </w:r>
+    </w:p>
+    <w:p>
+      <w:r>
+        <w:t>Se coloca un portapapeles con 20-30 hojas y un lapicero atado junto al buzón. El personal solo debe rellenar, doblar en tres y depositar.</w:t>
+      </w:r>
+    </w:p>
+    <w:p>
+      <w:pPr>
+        <w:pStyle w:val="Heading2"/>
+      </w:pPr>
+      <w:r>
+        <w:rPr>
+          <w:color w:val="1A1A2E"/>
+        </w:rPr>
+        <w:t>4.3 Responsable de transcripción</w:t>
+      </w:r>
+    </w:p>
+    <w:p>
+      <w:r>
+        <w:t>El Community Manager de Marketing es el encargado de:</w:t>
+      </w:r>
+    </w:p>
+    <w:p>
+      <w:pPr>
+        <w:pStyle w:val="ListNumber"/>
+      </w:pPr>
+      <w:r>
+        <w:t xml:space="preserve"> Abrir el buzón cada viernes a las 3:00 p.m.</w:t>
+      </w:r>
+    </w:p>
+    <w:p>
+      <w:pPr>
+        <w:pStyle w:val="ListNumber"/>
+      </w:pPr>
+      <w:r>
+        <w:t xml:space="preserve"> Fotografiar cada papelito como respaldo.</w:t>
+      </w:r>
+    </w:p>
+    <w:p>
+      <w:pPr>
+        <w:pStyle w:val="ListNumber"/>
+      </w:pPr>
+      <w:r>
+        <w:t xml:space="preserve"> Transcribir cada idea al Panel (sección "Mi Gran Idea") en un plazo máximo de 2 horas hábiles.</w:t>
+      </w:r>
+    </w:p>
+    <w:p>
+      <w:pPr>
+        <w:pStyle w:val="ListNumber"/>
+      </w:pPr>
+      <w:r>
+        <w:t xml:space="preserve"> Archivar físicamente los papelitos originales en una carpeta rotulada por mes.</w:t>
+      </w:r>
+    </w:p>
+    <w:p>
+      <w:pPr>
+        <w:pStyle w:val="ListNumber"/>
+      </w:pPr>
+      <w:r>
+        <w:t xml:space="preserve"> Dar estatus en el Panel: "Recibida" desde el momento de la transcripción.</w:t>
+      </w:r>
+    </w:p>
+    <w:p>
+      <w:r>
+        <w:rPr>
+          <w:b/>
+        </w:rPr>
+        <w:t xml:space="preserve">Nota: </w:t>
+      </w:r>
+      <w:r>
+        <w:t>El plazo de respuesta de 72 horas hábiles corre desde la transcripción (no desde el depósito). El CM deriva las ideas que requieran presupuesto o cambio estructural al Gerente de Ventas para evaluación previa.</w:t>
+      </w:r>
+    </w:p>
+    <w:p>
+      <w:pPr>
+        <w:pStyle w:val="Heading2"/>
+      </w:pPr>
+      <w:r>
+        <w:rPr>
+          <w:color w:val="1A1A2E"/>
+        </w:rPr>
+        <w:t>4.4 Retroalimentación al autor físico</w:t>
+      </w:r>
+    </w:p>
+    <w:p>
+      <w:r>
+        <w:t>El personal de almacén y limpieza no tiene acceso al Panel para consultar el estatus de su idea. Para evitar imprimir respuestas individuales, se usa un sistema de folio:</w:t>
+      </w:r>
+    </w:p>
+    <w:p>
+      <w:pPr>
+        <w:pStyle w:val="ListNumber"/>
+      </w:pPr>
+      <w:r>
+        <w:t xml:space="preserve"> Al abrir el buzón cada viernes, el CM asigna un número de folio correlativo a cada papelito (escrito en la esquina superior derecha).</w:t>
+      </w:r>
+    </w:p>
+    <w:p>
+      <w:pPr>
+        <w:pStyle w:val="ListNumber"/>
+      </w:pPr>
+      <w:r>
+        <w:t xml:space="preserve"> El CM transcribe la idea al Panel con ese mismo folio como identificador.</w:t>
+      </w:r>
+    </w:p>
+    <w:p>
+      <w:pPr>
+        <w:pStyle w:val="ListNumber"/>
+      </w:pPr>
+      <w:r>
+        <w:t xml:space="preserve"> El CM imprime un listado físico en una hoja A4 con los resultados semanales:</w:t>
+      </w:r>
+    </w:p>
+    <w:p>
+      <w:pPr>
+        <w:ind w:left="850"/>
+      </w:pPr>
+      <w:r>
+        <w:rPr>
+          <w:i/>
+          <w:sz w:val="19"/>
+        </w:rPr>
+        <w:t>Ejemplo:</w:t>
+        <w:br/>
+        <w:t>SEMANA DEL 07-07-2026</w:t>
+        <w:br/>
+        <w:t>Folio | Estatus</w:t>
+        <w:br/>
+        <w:t>#001  | Aprobada</w:t>
+        <w:br/>
+        <w:t>#002  | En evaluación</w:t>
+        <w:br/>
+        <w:t>#003  | No viable — requiere inversión fuera del presupuesto</w:t>
+      </w:r>
+    </w:p>
+    <w:p>
+      <w:pPr>
+        <w:pStyle w:val="ListNumber"/>
+      </w:pPr>
+      <w:r>
+        <w:t xml:space="preserve"> Ese listado se pega en la cartelera de almacén (junto al buzón) cada viernes.</w:t>
+      </w:r>
+    </w:p>
+    <w:p>
+      <w:pPr>
+        <w:pStyle w:val="ListBullet"/>
+      </w:pPr>
+      <w:r>
+        <w:t xml:space="preserve"> El autor reconoce su folio y sabe el estatus sin necesidad de papel adicional.</w:t>
+      </w:r>
+    </w:p>
+    <w:p>
+      <w:pPr>
+        <w:pStyle w:val="ListBullet"/>
+      </w:pPr>
+      <w:r>
+        <w:t xml:space="preserve"> Si la idea fue anónima, el folio es el único identificador visible.</w:t>
+      </w:r>
+    </w:p>
+    <w:p>
+      <w:r>
+        <w:t>Cero papeles extra por idea. Solo un listado semanal de una hoja.</w:t>
+      </w:r>
+    </w:p>
+    <w:p>
+      <w:pPr>
+        <w:pStyle w:val="Heading2"/>
+      </w:pPr>
+      <w:r>
+        <w:rPr>
+          <w:color w:val="1A1A2E"/>
+        </w:rPr>
+        <w:t>4.5 Stock y mantenimiento del buzón</w:t>
+      </w:r>
+    </w:p>
+    <w:p>
+      <w:pPr>
+        <w:pStyle w:val="ListBullet"/>
+      </w:pPr>
+      <w:r>
+        <w:t xml:space="preserve"> El CM verifica el estado del buzón cada viernes (ranura despejada, cerradura funcional).</w:t>
+      </w:r>
+    </w:p>
+    <w:p>
+      <w:pPr>
+        <w:pStyle w:val="ListBullet"/>
+      </w:pPr>
+      <w:r>
+        <w:t xml:space="preserve"> Repone el portapapeles con hojas en blanco.</w:t>
+      </w:r>
+    </w:p>
+    <w:p>
+      <w:pPr>
+        <w:pStyle w:val="ListBullet"/>
+      </w:pPr>
+      <w:r>
+        <w:t xml:space="preserve"> Reporta cualquier anomalía al coordinador de almacén para mantenimiento.</w:t>
+      </w:r>
+    </w:p>
+    <w:p>
+      <w:r>
+        <w:br w:type="page"/>
+      </w:r>
+    </w:p>
+    <w:p>
+      <w:pPr>
+        <w:pStyle w:val="Heading1"/>
+      </w:pPr>
+      <w:r>
+        <w:rPr>
+          <w:color w:val="1A1A2E"/>
+        </w:rPr>
+        <w:t>5. Integración con el Panel SUPRICOM</w:t>
       </w:r>
     </w:p>
     <w:p>
@@ -951,7 +1258,7 @@
         <w:rPr>
           <w:color w:val="1A1A2E"/>
         </w:rPr>
-        <w:t>5. Funcionalidades del Módulo</w:t>
+        <w:t>6. Funcionalidades del Módulo</w:t>
       </w:r>
     </w:p>
     <w:p>
@@ -962,7 +1269,7 @@
         <w:rPr>
           <w:color w:val="1A1A2E"/>
         </w:rPr>
-        <w:t>5.1 Para el colaborador (usuario)</w:t>
+        <w:t>6.1 Para el colaborador (usuario)</w:t>
       </w:r>
     </w:p>
     <w:p>
@@ -996,7 +1303,7 @@
         <w:ind w:left="567"/>
       </w:pPr>
       <w:r>
-        <w:t xml:space="preserve"> Categoría de la idea (lista desplegable — ver sección 7)</w:t>
+        <w:t xml:space="preserve"> Categoría de la idea (lista desplegable — ver sección 8)</w:t>
       </w:r>
     </w:p>
     <w:p>
@@ -1139,7 +1446,7 @@
         <w:rPr>
           <w:color w:val="1A1A2E"/>
         </w:rPr>
-        <w:t>5.2 Para el administrador / comité evaluador</w:t>
+        <w:t>6.2 Para el administrador / comité evaluador</w:t>
       </w:r>
     </w:p>
     <w:p>
@@ -1191,7 +1498,7 @@
         <w:ind w:left="567"/>
       </w:pPr>
       <w:r>
-        <w:t xml:space="preserve"> Asignación de puntaje según matriz de 100 puntos (ver sección 8).</w:t>
+        <w:t xml:space="preserve"> Asignación de puntaje según matriz de 100 puntos (ver sección 9).</w:t>
       </w:r>
     </w:p>
     <w:p>
@@ -1286,7 +1593,7 @@
         <w:rPr>
           <w:color w:val="1A1A2E"/>
         </w:rPr>
-        <w:t>6. Flujo del Proceso (Paso a Paso)</w:t>
+        <w:t>7. Flujo del Proceso (Paso a Paso)</w:t>
       </w:r>
     </w:p>
     <w:tbl>
@@ -1826,7 +2133,7 @@
         <w:rPr>
           <w:color w:val="1A1A2E"/>
         </w:rPr>
-        <w:t>7. Categorías de Ideas</w:t>
+        <w:t>8. Categorías de Ideas</w:t>
       </w:r>
     </w:p>
     <w:p>
@@ -2239,7 +2546,7 @@
         <w:rPr>
           <w:color w:val="1A1A2E"/>
         </w:rPr>
-        <w:t>8. Sistema de Evaluación y Puntaje</w:t>
+        <w:t>9. Sistema de Evaluación y Puntaje</w:t>
       </w:r>
     </w:p>
     <w:p>
@@ -2663,7 +2970,7 @@
         <w:rPr>
           <w:color w:val="1A1A2E"/>
         </w:rPr>
-        <w:t>9. Sistema de Reconocimiento</w:t>
+        <w:t>10. Sistema de Reconocimiento</w:t>
       </w:r>
     </w:p>
     <w:p>
@@ -2782,7 +3089,7 @@
         <w:rPr>
           <w:color w:val="1A1A2E"/>
         </w:rPr>
-        <w:t>10. Roles y Responsabilidades</w:t>
+        <w:t>11. Roles y Responsabilidades</w:t>
       </w:r>
     </w:p>
     <w:tbl>
@@ -2939,6 +3246,47 @@
               <w:rPr>
                 <w:sz w:val="18"/>
               </w:rPr>
+              <w:t>Transcriptor del Buzón Físico</w:t>
+            </w:r>
+          </w:p>
+        </w:tc>
+        <w:tc>
+          <w:tcPr>
+            <w:tcW w:type="dxa" w:w="3135"/>
+          </w:tcPr>
+          <w:p>
+            <w:r>
+              <w:rPr>
+                <w:sz w:val="18"/>
+              </w:rPr>
+              <w:t>Abre el buzón del almacén cada viernes. Fotografía y transcribe las ideas físicas al Panel. Archiva los originales.</w:t>
+            </w:r>
+          </w:p>
+        </w:tc>
+        <w:tc>
+          <w:tcPr>
+            <w:tcW w:type="dxa" w:w="3135"/>
+          </w:tcPr>
+          <w:p>
+            <w:r>
+              <w:rPr>
+                <w:sz w:val="18"/>
+              </w:rPr>
+              <w:t>Community Manager (Marketing)</w:t>
+            </w:r>
+          </w:p>
+        </w:tc>
+      </w:tr>
+      <w:tr>
+        <w:tc>
+          <w:tcPr>
+            <w:tcW w:type="dxa" w:w="3135"/>
+          </w:tcPr>
+          <w:p>
+            <w:r>
+              <w:rPr>
+                <w:sz w:val="18"/>
+              </w:rPr>
               <w:t>Comité Evaluador</w:t>
             </w:r>
           </w:p>
@@ -3062,7 +3410,7 @@
         <w:rPr>
           <w:color w:val="1A1A2E"/>
         </w:rPr>
-        <w:t>10.1 Modelo de Gobierno: ¿Quién manda en esto?</w:t>
+        <w:t>11.1 Modelo de Gobierno: ¿Quién manda en esto?</w:t>
       </w:r>
     </w:p>
     <w:p>
@@ -3564,7 +3912,7 @@
         <w:rPr>
           <w:color w:val="1A1A2E"/>
         </w:rPr>
-        <w:t>11. KPIs del Programa</w:t>
+        <w:t>12. KPIs del Programa</w:t>
       </w:r>
     </w:p>
     <w:tbl>
@@ -4039,7 +4387,7 @@
         <w:rPr>
           <w:color w:val="1A1A2E"/>
         </w:rPr>
-        <w:t>12. Plan de Implementación</w:t>
+        <w:t>13. Plan de Implementación</w:t>
       </w:r>
     </w:p>
     <w:tbl>
@@ -4406,7 +4754,7 @@
         <w:rPr>
           <w:color w:val="1A1A2E"/>
         </w:rPr>
-        <w:t>13. Anexos</w:t>
+        <w:t>14. Anexos</w:t>
       </w:r>
     </w:p>
     <w:p>
@@ -4663,7 +5011,7 @@
               <w:rPr>
                 <w:sz w:val="18"/>
               </w:rPr>
-              <w:t>TOTAL estimado</w:t>
+              <w:t>Buzón físico (buzón, cartel, hojas, lapicero)</w:t>
             </w:r>
           </w:p>
         </w:tc>
@@ -4676,7 +5024,35 @@
               <w:rPr>
                 <w:sz w:val="18"/>
               </w:rPr>
-              <w:t>SOLO premios (si aplica) — operación $0</w:t>
+              <w:t>Por definir — único costo real del programa; pendiente de cotizar</w:t>
+            </w:r>
+          </w:p>
+        </w:tc>
+      </w:tr>
+      <w:tr>
+        <w:tc>
+          <w:tcPr>
+            <w:tcW w:type="dxa" w:w="4703"/>
+          </w:tcPr>
+          <w:p>
+            <w:r>
+              <w:rPr>
+                <w:sz w:val="18"/>
+              </w:rPr>
+              <w:t>TOTAL operativo base (digital)</w:t>
+            </w:r>
+          </w:p>
+        </w:tc>
+        <w:tc>
+          <w:tcPr>
+            <w:tcW w:type="dxa" w:w="4703"/>
+          </w:tcPr>
+          <w:p>
+            <w:r>
+              <w:rPr>
+                <w:sz w:val="18"/>
+              </w:rPr>
+              <w:t>$0</w:t>
             </w:r>
           </w:p>
         </w:tc>

</xml_diff>